<commit_message>
Documentación del Segundo Parcial: reporte 4.2, diez microservicios, diagramas y presentación
</commit_message>
<xml_diff>
--- a/Arquitectura_Plataforma_Microhubs (1).docx
+++ b/Arquitectura_Plataforma_Microhubs (1).docx
@@ -5,48 +5,60 @@
     <w:p>
       <w:pPr>
         <w:pStyle w:val="Title"/>
-        <w:jc w:val="center"/>
+        <w:spacing w:after="120"/>
       </w:pPr>
       <w:r>
         <w:rPr>
           <w:color w:val="000000"/>
-          <w:sz w:val="48"/>
         </w:rPr>
         <w:t>Arquitectura de la Plataforma de Microhubs</w:t>
       </w:r>
     </w:p>
     <w:p>
       <w:pPr>
-        <w:spacing w:after="160"/>
-        <w:jc w:val="center"/>
+        <w:spacing w:after="120"/>
       </w:pPr>
       <w:r>
         <w:rPr>
-          <w:b/>
-          <w:color w:val="1270A8"/>
-          <w:sz w:val="24"/>
+          <w:color w:val="000000"/>
         </w:rPr>
-        <w:t>Arquitectura monolítica en capas</w:t>
+        <w:t>Segundo Parcial · Codex Innovations · Equipo 04 · Versión 4.2</w:t>
       </w:r>
     </w:p>
     <w:p>
       <w:pPr>
-        <w:spacing w:after="160"/>
-        <w:jc w:val="center"/>
+        <w:spacing w:after="120"/>
       </w:pPr>
       <w:r>
-        <w:t>La plataforma concentra sus funcionalidades en una sola aplicación Flask organizada por capas. PostgreSQL conserva los datos y reglas del negocio, mientras Redis administra sesiones, caché y carritos temporales.</w:t>
+        <w:rPr>
+          <w:color w:val="000000"/>
+        </w:rPr>
+        <w:t>La plataforma combina el portal Flask independiente con diez microservicios. Esta revisión refleja el código y Compose del ZIP recibido: Catálogos se divide en Productos, Zonas y Microhubs; Seguimiento recibe el GPS; los avisos permanecen en PostgreSQL y la web.</w:t>
       </w:r>
     </w:p>
     <w:p>
       <w:pPr>
-        <w:spacing w:after="160"/>
-        <w:jc w:val="center"/>
+        <w:pStyle w:val="Heading1"/>
+        <w:spacing w:after="120"/>
       </w:pPr>
       <w:r>
+        <w:rPr>
+          <w:color w:val="000000"/>
+        </w:rPr>
+        <w:t>Componentes y comunicación</w:t>
+      </w:r>
+    </w:p>
+    <w:p>
+      <w:pPr>
+        <w:spacing w:after="120"/>
+      </w:pPr>
+      <w:r>
+        <w:rPr>
+          <w:color w:val="000000"/>
+        </w:rPr>
         <w:drawing>
           <wp:inline xmlns:a="http://schemas.openxmlformats.org/drawingml/2006/main" xmlns:pic="http://schemas.openxmlformats.org/drawingml/2006/picture">
-            <wp:extent cx="6126480" cy="4819498"/>
+            <wp:extent cx="6035040" cy="5258522"/>
             <wp:docPr id="1" name="Picture 1"/>
             <wp:cNvGraphicFramePr>
               <a:graphicFrameLocks noChangeAspect="1"/>
@@ -55,7 +67,7 @@
               <a:graphicData uri="http://schemas.openxmlformats.org/drawingml/2006/picture">
                 <pic:pic>
                   <pic:nvPicPr>
-                    <pic:cNvPr id="0" name="arquitectura-diagrama.png"/>
+                    <pic:cNvPr id="0" name="02_contenedores.png"/>
                     <pic:cNvPicPr/>
                   </pic:nvPicPr>
                   <pic:blipFill>
@@ -67,7 +79,7 @@
                   <pic:spPr>
                     <a:xfrm>
                       <a:off x="0" y="0"/>
-                      <a:ext cx="6126480" cy="4819498"/>
+                      <a:ext cx="6035040" cy="5258522"/>
                     </a:xfrm>
                     <a:prstGeom prst="rect"/>
                   </pic:spPr>
@@ -80,135 +92,486 @@
     </w:p>
     <w:p>
       <w:pPr>
-        <w:spacing w:after="80"/>
+        <w:spacing w:after="120"/>
       </w:pPr>
       <w:r>
         <w:rPr>
-          <w:b/>
-          <w:color w:val="1270A8"/>
+          <w:color w:val="000000"/>
         </w:rPr>
-        <w:t xml:space="preserve">Justificación. </w:t>
-      </w:r>
-      <w:r>
-        <w:t>Esta arquitectura facilita el desarrollo y despliegue para un equipo pequeño, mantiene transacciones simples y permite compartir las reglas de negocio en una sola base de datos.</w:t>
+        <w:t>El navegador usa la web :5000. Android, escritorio y Swagger consumen las APIs por HTTP con JWT. integracion.py reenvía el token del usuario y consulta los servicios. Las operaciones base del portal siguen disponibles cuando un servicio no responde.</w:t>
       </w:r>
     </w:p>
     <w:p>
       <w:pPr>
-        <w:spacing w:after="0"/>
+        <w:spacing w:after="120"/>
       </w:pPr>
       <w:r>
         <w:rPr>
-          <w:b/>
-          <w:color w:val="1270A8"/>
+          <w:color w:val="000000"/>
         </w:rPr>
-        <w:t xml:space="preserve">Despliegue. </w:t>
-      </w:r>
-      <w:r>
-        <w:t>Flask, PostgreSQL y Redis se ejecutan como contenedores coordinados mediante Docker Compose.</w:t>
-      </w:r>
-    </w:p>
-    <w:p>
-      <w:r>
         <w:br w:type="page"/>
       </w:r>
     </w:p>
     <w:p>
       <w:pPr>
-        <w:spacing w:after="100"/>
-        <w:jc w:val="center"/>
+        <w:pStyle w:val="Heading1"/>
+        <w:spacing w:after="120"/>
       </w:pPr>
       <w:r>
         <w:rPr>
-          <w:b/>
           <w:color w:val="000000"/>
-          <w:sz w:val="42"/>
         </w:rPr>
-        <w:t>Diseño de datos de la Plataforma de Microhubs</w:t>
+        <w:t>Servicios y puertos</w:t>
+      </w:r>
+    </w:p>
+    <w:tbl>
+      <w:tblPr>
+        <w:tblStyle w:val="TableGrid"/>
+        <w:tblW w:type="auto" w:w="0"/>
+        <w:tblLayout w:type="fixed"/>
+        <w:tblLook w:firstColumn="1" w:firstRow="1" w:lastColumn="0" w:lastRow="0" w:noHBand="0" w:noVBand="1" w:val="04A0"/>
+      </w:tblPr>
+      <w:tblGrid>
+        <w:gridCol w:w="3408"/>
+        <w:gridCol w:w="3408"/>
+        <w:gridCol w:w="3408"/>
+      </w:tblGrid>
+      <w:tr>
+        <w:tc>
+          <w:tcPr>
+            <w:tcW w:type="dxa" w:w="1872"/>
+          </w:tcPr>
+          <w:p>
+            <w:r>
+              <w:t>Servicio</w:t>
+            </w:r>
+          </w:p>
+        </w:tc>
+        <w:tc>
+          <w:tcPr>
+            <w:tcW w:type="dxa" w:w="936"/>
+          </w:tcPr>
+          <w:p>
+            <w:r>
+              <w:t>Puerto</w:t>
+            </w:r>
+          </w:p>
+        </w:tc>
+        <w:tc>
+          <w:tcPr>
+            <w:tcW w:type="dxa" w:w="7416"/>
+          </w:tcPr>
+          <w:p>
+            <w:r>
+              <w:t>Responsabilidad</w:t>
+            </w:r>
+          </w:p>
+        </w:tc>
+      </w:tr>
+      <w:tr>
+        <w:tc>
+          <w:tcPr>
+            <w:tcW w:type="dxa" w:w="1872"/>
+          </w:tcPr>
+          <w:p>
+            <w:r>
+              <w:t>Auth</w:t>
+            </w:r>
+          </w:p>
+        </w:tc>
+        <w:tc>
+          <w:tcPr>
+            <w:tcW w:type="dxa" w:w="936"/>
+          </w:tcPr>
+          <w:p>
+            <w:r>
+              <w:t>5101</w:t>
+            </w:r>
+          </w:p>
+        </w:tc>
+        <w:tc>
+          <w:tcPr>
+            <w:tcW w:type="dxa" w:w="7416"/>
+          </w:tcPr>
+          <w:p>
+            <w:r>
+              <w:t>Sesión común y tokens</w:t>
+            </w:r>
+          </w:p>
+        </w:tc>
+      </w:tr>
+      <w:tr>
+        <w:tc>
+          <w:tcPr>
+            <w:tcW w:type="dxa" w:w="1872"/>
+          </w:tcPr>
+          <w:p>
+            <w:r>
+              <w:t>Usuarios</w:t>
+            </w:r>
+          </w:p>
+        </w:tc>
+        <w:tc>
+          <w:tcPr>
+            <w:tcW w:type="dxa" w:w="936"/>
+          </w:tcPr>
+          <w:p>
+            <w:r>
+              <w:t>5102</w:t>
+            </w:r>
+          </w:p>
+        </w:tc>
+        <w:tc>
+          <w:tcPr>
+            <w:tcW w:type="dxa" w:w="7416"/>
+          </w:tcPr>
+          <w:p>
+            <w:r>
+              <w:t>Perfil y directorio</w:t>
+            </w:r>
+          </w:p>
+        </w:tc>
+      </w:tr>
+      <w:tr>
+        <w:tc>
+          <w:tcPr>
+            <w:tcW w:type="dxa" w:w="1872"/>
+          </w:tcPr>
+          <w:p>
+            <w:r>
+              <w:t>Productos</w:t>
+            </w:r>
+          </w:p>
+        </w:tc>
+        <w:tc>
+          <w:tcPr>
+            <w:tcW w:type="dxa" w:w="936"/>
+          </w:tcPr>
+          <w:p>
+            <w:r>
+              <w:t>5103</w:t>
+            </w:r>
+          </w:p>
+        </w:tc>
+        <w:tc>
+          <w:tcPr>
+            <w:tcW w:type="dxa" w:w="7416"/>
+          </w:tcPr>
+          <w:p>
+            <w:r>
+              <w:t>Catálogo comercial</w:t>
+            </w:r>
+          </w:p>
+        </w:tc>
+      </w:tr>
+      <w:tr>
+        <w:tc>
+          <w:tcPr>
+            <w:tcW w:type="dxa" w:w="1872"/>
+          </w:tcPr>
+          <w:p>
+            <w:r>
+              <w:t>Pedidos</w:t>
+            </w:r>
+          </w:p>
+        </w:tc>
+        <w:tc>
+          <w:tcPr>
+            <w:tcW w:type="dxa" w:w="936"/>
+          </w:tcPr>
+          <w:p>
+            <w:r>
+              <w:t>5104</w:t>
+            </w:r>
+          </w:p>
+        </w:tc>
+        <w:tc>
+          <w:tcPr>
+            <w:tcW w:type="dxa" w:w="7416"/>
+          </w:tcPr>
+          <w:p>
+            <w:r>
+              <w:t>Consulta, historial y estados</w:t>
+            </w:r>
+          </w:p>
+        </w:tc>
+      </w:tr>
+      <w:tr>
+        <w:tc>
+          <w:tcPr>
+            <w:tcW w:type="dxa" w:w="1872"/>
+          </w:tcPr>
+          <w:p>
+            <w:r>
+              <w:t>Entregas</w:t>
+            </w:r>
+          </w:p>
+        </w:tc>
+        <w:tc>
+          <w:tcPr>
+            <w:tcW w:type="dxa" w:w="936"/>
+          </w:tcPr>
+          <w:p>
+            <w:r>
+              <w:t>5105</w:t>
+            </w:r>
+          </w:p>
+        </w:tc>
+        <w:tc>
+          <w:tcPr>
+            <w:tcW w:type="dxa" w:w="7416"/>
+          </w:tcPr>
+          <w:p>
+            <w:r>
+              <w:t>Paradas y cierre idempotente</w:t>
+            </w:r>
+          </w:p>
+        </w:tc>
+      </w:tr>
+      <w:tr>
+        <w:tc>
+          <w:tcPr>
+            <w:tcW w:type="dxa" w:w="1872"/>
+          </w:tcPr>
+          <w:p>
+            <w:r>
+              <w:t>Planeación</w:t>
+            </w:r>
+          </w:p>
+        </w:tc>
+        <w:tc>
+          <w:tcPr>
+            <w:tcW w:type="dxa" w:w="936"/>
+          </w:tcPr>
+          <w:p>
+            <w:r>
+              <w:t>5106</w:t>
+            </w:r>
+          </w:p>
+        </w:tc>
+        <w:tc>
+          <w:tcPr>
+            <w:tcW w:type="dxa" w:w="7416"/>
+          </w:tcPr>
+          <w:p>
+            <w:r>
+              <w:t>Candidatos y simulaciones</w:t>
+            </w:r>
+          </w:p>
+        </w:tc>
+      </w:tr>
+      <w:tr>
+        <w:tc>
+          <w:tcPr>
+            <w:tcW w:type="dxa" w:w="1872"/>
+          </w:tcPr>
+          <w:p>
+            <w:r>
+              <w:t>Documentos</w:t>
+            </w:r>
+          </w:p>
+        </w:tc>
+        <w:tc>
+          <w:tcPr>
+            <w:tcW w:type="dxa" w:w="936"/>
+          </w:tcPr>
+          <w:p>
+            <w:r>
+              <w:t>5107</w:t>
+            </w:r>
+          </w:p>
+        </w:tc>
+        <w:tc>
+          <w:tcPr>
+            <w:tcW w:type="dxa" w:w="7416"/>
+          </w:tcPr>
+          <w:p>
+            <w:r>
+              <w:t>Archivos y evidencias</w:t>
+            </w:r>
+          </w:p>
+        </w:tc>
+      </w:tr>
+      <w:tr>
+        <w:tc>
+          <w:tcPr>
+            <w:tcW w:type="dxa" w:w="1872"/>
+          </w:tcPr>
+          <w:p>
+            <w:r>
+              <w:t>Zonas</w:t>
+            </w:r>
+          </w:p>
+        </w:tc>
+        <w:tc>
+          <w:tcPr>
+            <w:tcW w:type="dxa" w:w="936"/>
+          </w:tcPr>
+          <w:p>
+            <w:r>
+              <w:t>5108</w:t>
+            </w:r>
+          </w:p>
+        </w:tc>
+        <w:tc>
+          <w:tcPr>
+            <w:tcW w:type="dxa" w:w="7416"/>
+          </w:tcPr>
+          <w:p>
+            <w:r>
+              <w:t>Colonias y cobertura</w:t>
+            </w:r>
+          </w:p>
+        </w:tc>
+      </w:tr>
+      <w:tr>
+        <w:tc>
+          <w:tcPr>
+            <w:tcW w:type="dxa" w:w="1872"/>
+          </w:tcPr>
+          <w:p>
+            <w:r>
+              <w:t>Microhubs</w:t>
+            </w:r>
+          </w:p>
+        </w:tc>
+        <w:tc>
+          <w:tcPr>
+            <w:tcW w:type="dxa" w:w="936"/>
+          </w:tcPr>
+          <w:p>
+            <w:r>
+              <w:t>5109</w:t>
+            </w:r>
+          </w:p>
+        </w:tc>
+        <w:tc>
+          <w:tcPr>
+            <w:tcW w:type="dxa" w:w="7416"/>
+          </w:tcPr>
+          <w:p>
+            <w:r>
+              <w:t>Red de puntos de operación</w:t>
+            </w:r>
+          </w:p>
+        </w:tc>
+      </w:tr>
+      <w:tr>
+        <w:tc>
+          <w:tcPr>
+            <w:tcW w:type="dxa" w:w="1872"/>
+          </w:tcPr>
+          <w:p>
+            <w:r>
+              <w:t>Seguimiento</w:t>
+            </w:r>
+          </w:p>
+        </w:tc>
+        <w:tc>
+          <w:tcPr>
+            <w:tcW w:type="dxa" w:w="936"/>
+          </w:tcPr>
+          <w:p>
+            <w:r>
+              <w:t>5110</w:t>
+            </w:r>
+          </w:p>
+        </w:tc>
+        <w:tc>
+          <w:tcPr>
+            <w:tcW w:type="dxa" w:w="7416"/>
+          </w:tcPr>
+          <w:p>
+            <w:r>
+              <w:t>Ubicaciones GPS y recorrido</w:t>
+            </w:r>
+          </w:p>
+        </w:tc>
+      </w:tr>
+    </w:tbl>
+    <w:p>
+      <w:pPr>
+        <w:pStyle w:val="Heading1"/>
+        <w:spacing w:after="120"/>
+      </w:pPr>
+      <w:r>
+        <w:rPr>
+          <w:color w:val="000000"/>
+        </w:rPr>
+        <w:t>Datos y sesión común</w:t>
       </w:r>
     </w:p>
     <w:p>
       <w:pPr>
-        <w:spacing w:after="160"/>
-        <w:jc w:val="center"/>
+        <w:spacing w:after="120"/>
       </w:pPr>
       <w:r>
-        <w:t>Los datos se organizan por módulos funcionales, aunque todos forman parte de una sola base PostgreSQL. Esta decisión permite mantener relaciones, transacciones y reglas de negocio consistentes entre catálogo, inventario, pedidos, territorio y usuarios.</w:t>
+        <w:rPr>
+          <w:color w:val="000000"/>
+        </w:rPr>
+        <w:t>PostgreSQL conserva pedidos, inventario, entregas, reglas, auditoría y avisos. MongoDB guarda documentos, puntos GPS, simulaciones y registros técnicos. Redis valida sesiones y revocación, además de mantener caché y límites temporales. Los servicios comparten almacenes; no se comunican directamente entre sí.</w:t>
       </w:r>
     </w:p>
     <w:p>
       <w:pPr>
-        <w:spacing w:after="140"/>
-        <w:jc w:val="center"/>
+        <w:spacing w:after="120"/>
       </w:pPr>
       <w:r>
-        <w:drawing>
-          <wp:inline xmlns:a="http://schemas.openxmlformats.org/drawingml/2006/main" xmlns:pic="http://schemas.openxmlformats.org/drawingml/2006/picture">
-            <wp:extent cx="6263640" cy="4345400"/>
-            <wp:docPr id="2" name="Picture 2"/>
-            <wp:cNvGraphicFramePr>
-              <a:graphicFrameLocks noChangeAspect="1"/>
-            </wp:cNvGraphicFramePr>
-            <a:graphic>
-              <a:graphicData uri="http://schemas.openxmlformats.org/drawingml/2006/picture">
-                <pic:pic>
-                  <pic:nvPicPr>
-                    <pic:cNvPr id="0" name="diseno-datos-microhubs.png"/>
-                    <pic:cNvPicPr/>
-                  </pic:nvPicPr>
-                  <pic:blipFill>
-                    <a:blip r:embed="rId10"/>
-                    <a:stretch>
-                      <a:fillRect/>
-                    </a:stretch>
-                  </pic:blipFill>
-                  <pic:spPr>
-                    <a:xfrm>
-                      <a:off x="0" y="0"/>
-                      <a:ext cx="6263640" cy="4345400"/>
-                    </a:xfrm>
-                    <a:prstGeom prst="rect"/>
-                  </pic:spPr>
-                </pic:pic>
-              </a:graphicData>
-            </a:graphic>
-          </wp:inline>
-        </w:drawing>
+        <w:rPr>
+          <w:color w:val="000000"/>
+        </w:rPr>
+        <w:t>El recorrido usa POST /api/v1/seguimiento/{id}/ubicaciones y GET /api/v1/seguimiento/{id}/recorrido en :5110. El cierre conserva POST /api/v1/entregas/{id}/resultado en :5105. Documentos almacena los archivos en :5107. Los triggers crean avisos en web_notificacion y el portal los muestra.</w:t>
       </w:r>
     </w:p>
     <w:p>
       <w:pPr>
-        <w:spacing w:after="80"/>
+        <w:pStyle w:val="Heading1"/>
+        <w:spacing w:after="120"/>
       </w:pPr>
       <w:r>
         <w:rPr>
-          <w:b/>
-          <w:color w:val="1270A8"/>
+          <w:color w:val="000000"/>
         </w:rPr>
-        <w:t xml:space="preserve">Organización. </w:t>
-      </w:r>
-      <w:r>
-        <w:t>Cada módulo agrupa las tablas de las que es responsable, pero las relaciones entre módulos se conservan mediante claves foráneas dentro de PostgreSQL.</w:t>
+        <w:t>Despliegue y persistencia</w:t>
       </w:r>
     </w:p>
     <w:p>
       <w:pPr>
-        <w:spacing w:after="0"/>
+        <w:spacing w:after="120"/>
       </w:pPr>
       <w:r>
         <w:rPr>
-          <w:b/>
-          <w:color w:val="1270A8"/>
+          <w:color w:val="000000"/>
         </w:rPr>
-        <w:t xml:space="preserve">Persistencia temporal. </w:t>
+        <w:t>Compose define 15 contenedores: diez servicios, web, PostgreSQL, MongoDB, Redis y migraciones. Catorce permanecen en ejecución; migraciones termina con código 0. Las bases no publican puertos. datos_pg y datos_mongo persisten con down; Redis no tiene persistencia. La política noeviction corresponde a toda la instancia Redis.</w:t>
       </w:r>
+    </w:p>
+    <w:p>
+      <w:pPr>
+        <w:pStyle w:val="Heading1"/>
+        <w:spacing w:after="120"/>
+      </w:pPr>
       <w:r>
-        <w:t>Redis mantiene sesiones, permisos en caché, carritos y bloqueos. Estos datos son temporales y no reemplazan la información persistente de la base principal.</w:t>
+        <w:rPr>
+          <w:color w:val="000000"/>
+        </w:rPr>
+        <w:t>Verificación y límites</w:t>
+      </w:r>
+    </w:p>
+    <w:p>
+      <w:pPr>
+        <w:spacing w:after="120"/>
+      </w:pPr>
+      <w:r>
+        <w:rPr>
+          <w:color w:val="000000"/>
+        </w:rPr>
+        <w:t>El inventario del código contiene 45 operaciones método-ruta, excluyendo salud y documentación. La evidencia adjunta registra 93 casos aprobados. Esta revisión no levantó las bases ni repitió pruebas: se deben renovar las capturas del tablero y docker compose ps -a para acreditar los diez servicios en el entorno del equipo.</w:t>
       </w:r>
     </w:p>
     <w:sectPr>
       <w:pgSz w:w="12240" w:h="15840"/>
-      <w:pgMar w:top="792" w:right="1008" w:bottom="792" w:left="1008" w:header="720" w:footer="720" w:gutter="0"/>
+      <w:pgMar w:top="936" w:right="1008" w:bottom="936" w:left="1008" w:header="720" w:footer="720" w:gutter="0"/>
       <w:cols w:space="720"/>
       <w:docGrid w:linePitch="360"/>
     </w:sectPr>
@@ -580,8 +943,8 @@
     <w:qFormat/>
     <w:rsid w:val="00FC693F"/>
     <w:rPr>
-      <w:rFonts w:ascii="Aptos" w:hAnsi="Aptos"/>
-      <w:sz w:val="21"/>
+      <w:rFonts w:ascii="Calibri" w:hAnsi="Calibri"/>
+      <w:sz w:val="22"/>
     </w:rPr>
   </w:style>
   <w:style w:type="paragraph" w:styleId="Header">
@@ -646,7 +1009,7 @@
       <w:rFonts w:asciiTheme="majorHAnsi" w:eastAsiaTheme="majorEastAsia" w:hAnsiTheme="majorHAnsi" w:cstheme="majorBidi"/>
       <w:b/>
       <w:bCs/>
-      <w:color w:val="365F91" w:themeColor="accent1" w:themeShade="BF"/>
+      <w:color w:val="000000"/>
       <w:sz w:val="28"/>
       <w:szCs w:val="28"/>
     </w:rPr>
@@ -670,7 +1033,7 @@
       <w:rFonts w:asciiTheme="majorHAnsi" w:eastAsiaTheme="majorEastAsia" w:hAnsiTheme="majorHAnsi" w:cstheme="majorBidi"/>
       <w:b/>
       <w:bCs/>
-      <w:color w:val="4F81BD" w:themeColor="accent1"/>
+      <w:color w:val="000000"/>
       <w:sz w:val="26"/>
       <w:szCs w:val="26"/>
     </w:rPr>
@@ -929,11 +1292,11 @@
       <w:contextualSpacing/>
     </w:pPr>
     <w:rPr>
-      <w:rFonts w:asciiTheme="majorHAnsi" w:eastAsiaTheme="majorEastAsia" w:hAnsiTheme="majorHAnsi" w:cstheme="majorBidi" w:ascii="Aptos Display" w:hAnsi="Aptos Display"/>
+      <w:rFonts w:asciiTheme="majorHAnsi" w:eastAsiaTheme="majorEastAsia" w:hAnsiTheme="majorHAnsi" w:cstheme="majorBidi"/>
       <w:color w:val="000000"/>
       <w:spacing w:val="5"/>
       <w:kern w:val="28"/>
-      <w:sz w:val="48"/>
+      <w:sz w:val="52"/>
       <w:szCs w:val="52"/>
     </w:rPr>
   </w:style>
@@ -1409,9 +1772,6 @@
     <w:qFormat/>
     <w:rsid w:val="00FC693F"/>
     <w:pPr>
-      <w:pBdr>
-        <w:bottom w:val="single" w:sz="4" w:space="4" w:color="4F81BD" w:themeColor="accent1"/>
-      </w:pBdr>
       <w:spacing w:before="200" w:after="280"/>
       <w:ind w:left="936" w:right="936"/>
     </w:pPr>

</xml_diff>

<commit_message>
Ruth Soriano: textos finales, evidencia Git y deuda tecnica
- Reporte y documento de arquitectura: se reescriben los parrafos que hablaban de un ZIP
  y de una revision sin ejecutar; el reporte pasa a decir lo que se ejecuto el 13 de octubre.
- Evidencia Git con los PR #8 a #17 y los commits del video; deuda tecnica con la base
  compartida, la copia de codigo del web en planeacion y la lectura directa de MongoDB.
- Presentacion: diapositivas 27 y 31 y sus notas en lenguaje directo; guion en PDF regenerado.
- CAMBIOS_DOCUMENTACION_SEGUNDO_PARCIAL.md, LEEME de la presentacion y de capturas reescritos;
  se corrigen dos menciones de ocho microservicios.
</commit_message>
<xml_diff>
--- a/Arquitectura_Plataforma_Microhubs (1).docx
+++ b/Arquitectura_Plataforma_Microhubs (1).docx
@@ -33,7 +33,7 @@
         <w:rPr>
           <w:color w:val="000000"/>
         </w:rPr>
-        <w:t>La plataforma combina el portal Flask independiente con diez microservicios. Esta revisión refleja el código y Compose del ZIP recibido: Catálogos se divide en Productos, Zonas y Microhubs; Seguimiento recibe el GPS; los avisos permanecen en PostgreSQL y la web.</w:t>
+        <w:t>La plataforma combina el portal Flask, que funciona solo, con diez microservicios. Catálogos se dividió en Productos, Zonas y Microhubs, Seguimiento recibe el GPS y los avisos se quedan en PostgreSQL y en el portal.</w:t>
       </w:r>
     </w:p>
     <w:p>
@@ -566,7 +566,7 @@
         <w:rPr>
           <w:color w:val="000000"/>
         </w:rPr>
-        <w:t>El inventario del código contiene 45 operaciones método-ruta, excluyendo salud y documentación. La evidencia adjunta registra 93 casos aprobados. Esta revisión no levantó las bases ni repitió pruebas: se deben renovar las capturas del tablero y docker compose ps -a para acreditar los diez servicios en el entorno del equipo.</w:t>
+        <w:t>El inventario del código tiene 45 operaciones método-ruta, sin contar la salud ni la documentación. La evidencia registra 93 casos aprobados y 3 complementarios; las capturas del tablero y de docker compose ps -a son del despliegue actual.</w:t>
       </w:r>
     </w:p>
     <w:sectPr>

</xml_diff>